<commit_message>
InfoQ CADEC article: takeaways rewritten as five lessons (127 words); the third run's 70% / 84% agreement stated in the body
Each takeaway now opens with what the reader should do and closes with the
number that earns it. The run-to-run point cites the agreement figures, so
they are added to "We nearly published": the third run agreed with the
byte-identical pair on 70 percent of mentions and 84 percent of codes where
all three found the span. Three sentences trimmed elsewhere; 2,995 words
excluding code. Word file rebuilt.

Co-Authored-By: Claude Fable 5.1 <noreply@anthropic.com>
</commit_message>
<xml_diff>
--- a/docs/Group 3 – Six Reliability Layers Around an LLM Sorted Its Answers and Fixed Almost None.docx
+++ b/docs/Group 3 – Six Reliability Layers Around an LLM Sorted Its Answers and Fixed Almost None.docx
@@ -48,7 +48,7 @@
         </w:numPr>
       </w:pPr>
       <w:r>
-        <w:t xml:space="preserve">The model produced every answer; the six layers above it sorted those answers by how far to trust them and fixed almost none.</w:t>
+        <w:t xml:space="preserve">Reliability layers do not make a model more accurate; they tell you which answers to trust. Plan for whoever handles what they refuse to ship.</w:t>
       </w:r>
     </w:p>
     <w:p>
@@ -60,7 +60,7 @@
         </w:numPr>
       </w:pPr>
       <w:r>
-        <w:t xml:space="preserve">A nine-line vocabulary check did the sorting that mattered, turning two-in-five odds into five in six and two in seven for zero tokens; the three paid layers changed one shipped answer in 53.</w:t>
+        <w:t xml:space="preserve">Start with the check that costs nothing: a string comparison against our vocabulary sorted answers into tiers 83 and 28 percent correct; three paid layers changed one shipped answer.</w:t>
       </w:r>
     </w:p>
     <w:p>
@@ -72,7 +72,7 @@
         </w:numPr>
       </w:pPr>
       <w:r>
-        <w:t xml:space="preserve">Shipping on any verdict is one dial, precision up and yield down. We show every setting and pick none.</w:t>
+        <w:t xml:space="preserve">Ask the model to read, never to remember: it picked well from a retrieved menu but invented 13 to 18 percent of the codes asked of it.</w:t>
       </w:r>
     </w:p>
     <w:p>
@@ -84,7 +84,7 @@
         </w:numPr>
       </w:pPr>
       <w:r>
-        <w:t xml:space="preserve">Measure the run-to-run floor first: three identical runs at temperature 0 differed by four F1 points, enough to reverse a result's sign.</w:t>
+        <w:t xml:space="preserve">Never trust one run, even at temperature 0: two runs matched byte for byte, the third agreed on 70 percent of mentions, and that gap reversed an improvement's sign.</w:t>
       </w:r>
     </w:p>
     <w:p>
@@ -96,7 +96,7 @@
         </w:numPr>
       </w:pPr>
       <w:r>
-        <w:t xml:space="preserve">Let the model read and let code hold the knowledge; asked to recall identifiers, the model fabricated 13 to 18 percent of them, and nothing above it can see what it missed.</w:t>
+        <w:t xml:space="preserve">Score what a layer withholds, not only what it ships: precision rises whenever answers are withdrawn; yield does not.</w:t>
       </w:r>
     </w:p>
     <w:p>
@@ -365,7 +365,7 @@
         <w:pStyle w:val="BodyText"/>
       </w:pPr>
       <w:r>
-        <w:t xml:space="preserve">As a product this is not shippable: three quarters of the batch went to a person, and that tier holds more correct answers than the shipped one. As a signal it is the result: a zero-token check split two-in-five odds into five in six and two in seven. It improved nothing; it sorted. This article is mostly about the four layers meant to do more.</w:t>
+        <w:t xml:space="preserve">As a product this is not shippable: three quarters of the batch went to a person, and that tier holds more correct answers than the shipped one. As a signal it is the result: a zero-token check split two-in-five odds into five in six and two in seven. It improved nothing; it sorted.</w:t>
       </w:r>
     </w:p>
     <w:bookmarkEnd w:id="10"/>
@@ -1079,7 +1079,7 @@
         <w:pStyle w:val="BodyText"/>
       </w:pPr>
       <w:r>
-        <w:t xml:space="preserve">We ran the extraction step three times, cold, on the same 40 documents, at temperature 0. Two were byte-identical; the third diverged from its fifth request on: 87, 87 and 98 correct of 226, four points of F1.</w:t>
+        <w:t xml:space="preserve">We ran the extraction step three times, cold, on the same 40 documents, at temperature 0. Two were byte-identical; the third diverged from its fifth request on: 87, 87 and 98 correct of 226, four points of F1. The third still agreed with the pair on 70 percent of mentions outright, and on 84 percent of codes where all three found the same span; the remainder was worth those four points.</w:t>
       </w:r>
     </w:p>
     <w:p>
@@ -2825,7 +2825,7 @@
         <w:t xml:space="preserve"> </w:t>
       </w:r>
       <w:r>
-        <w:t xml:space="preserve">The ladder's ceiling is the extractor's detection, 0.521 exact on the held-out split. Reliability engineering of this kind makes answers more trustworthy, not the system more perceptive.</w:t>
+        <w:t xml:space="preserve">The ladder's ceiling is the extractor's detection, 0.521 exact on the held-out split.</w:t>
       </w:r>
     </w:p>
     <w:bookmarkEnd w:id="24"/>
@@ -3058,7 +3058,7 @@
         <w:t xml:space="preserve"> </w:t>
       </w:r>
       <w:r>
-        <w:t xml:space="preserve">Sent alone eight times, the diverging prompt returns one reply; it moves only inside a full run, so the server's state is the suspect.</w:t>
+        <w:t xml:space="preserve">Sent alone eight times, the diverging prompt returns one reply; it moves only inside a full run.</w:t>
       </w:r>
     </w:p>
     <w:p>

</xml_diff>

<commit_message>
InfoQ CADEC article: three takeaways rewritten in plainer words — the free check, repeat runs as a validation step, correct-over-all-inputs
Co-Authored-By: Claude Fable 5.1 <noreply@anthropic.com>
</commit_message>
<xml_diff>
--- a/docs/Group 3 – Six Reliability Layers Around an LLM Sorted Its Answers and Fixed Almost None.docx
+++ b/docs/Group 3 – Six Reliability Layers Around an LLM Sorted Its Answers and Fixed Almost None.docx
@@ -48,7 +48,7 @@
         </w:numPr>
       </w:pPr>
       <w:r>
-        <w:t xml:space="preserve">Reliability layers do not make a model more accurate; they tell you which answers to trust. Plan for whoever handles what they refuse to ship.</w:t>
+        <w:t xml:space="preserve">Reliability layers do not make a model more accurate; they tell you which answers to trust. Plan for who handles what they refuse.</w:t>
       </w:r>
     </w:p>
     <w:p>
@@ -60,7 +60,7 @@
         </w:numPr>
       </w:pPr>
       <w:r>
-        <w:t xml:space="preserve">Start with the check that costs nothing: a string comparison against our vocabulary sorted answers into tiers 83 and 28 percent correct; three paid layers changed one shipped answer.</w:t>
+        <w:t xml:space="preserve">Start with a check that costs nothing: matching answers' words against the vocabulary split them into groups 83 and 28 percent right; three paid layers changed one answer.</w:t>
       </w:r>
     </w:p>
     <w:p>
@@ -72,7 +72,7 @@
         </w:numPr>
       </w:pPr>
       <w:r>
-        <w:t xml:space="preserve">Ask the model to read, never to remember: it picked well from a retrieved menu but invented 13 to 18 percent of the codes asked of it.</w:t>
+        <w:t xml:space="preserve">Ask the model to read, never to remember: it picked well from a menu but invented 13 to 18 percent of the codes asked of it.</w:t>
       </w:r>
     </w:p>
     <w:p>
@@ -84,7 +84,7 @@
         </w:numPr>
       </w:pPr>
       <w:r>
-        <w:t xml:space="preserve">Never trust one run, even at temperature 0: two runs matched byte for byte, the third agreed on 70 percent of mentions, and that gap reversed an improvement's sign.</w:t>
+        <w:t xml:space="preserve">Make repeat runs a validation step: rerun the same inputs, measure how far the answers move, and set the difference you accept; ours agreed on 70 percent at temperature 0.</w:t>
       </w:r>
     </w:p>
     <w:p>
@@ -96,7 +96,7 @@
         </w:numPr>
       </w:pPr>
       <w:r>
-        <w:t xml:space="preserve">Score what a layer withholds, not only what it ships: precision rises whenever answers are withdrawn; yield does not.</w:t>
+        <w:t xml:space="preserve">Measure correct answers over all inputs, not only those the system chose to answer; refusing always makes the remaining answers look more accurate.</w:t>
       </w:r>
     </w:p>
     <w:p>

</xml_diff>

<commit_message>
InfoQ CADEC article: takeaways as five lessons, body aligned, and the submission rules made a test
Takeaways (130 words) rewritten as lessons a reader can apply; the free-check
line no longer claims "better than the paid layers" (the menu-shown judge
separates more sharply and is merely unread). Body: the third run's 70% / 84%
agreement added where a takeaway cited it; the floor practice says "decide
what difference you will accept". tests/test_infoq_article.py enforces the six
mechanical InfoQ rules — word budget, five takeaways <= 130 words as sentences,
byline, captions with source, no tracking links, and a "Group N – title.docx"
whose text carries the title, every takeaway and every caption (the previous
export fails it). docs/INFOQ-SUBMISSION.md holds the rules, the pandoc command
and the four items only a person can do. 2,989 words excluding code.

Co-Authored-By: Claude Fable 5.1 <noreply@anthropic.com>
</commit_message>
<xml_diff>
--- a/docs/Group 3 – Six Reliability Layers Around an LLM Sorted Its Answers and Fixed Almost None.docx
+++ b/docs/Group 3 – Six Reliability Layers Around an LLM Sorted Its Answers and Fixed Almost None.docx
@@ -48,7 +48,7 @@
         </w:numPr>
       </w:pPr>
       <w:r>
-        <w:t xml:space="preserve">Reliability layers do not make a model more accurate; they tell you which answers to trust. Plan for who handles what they refuse.</w:t>
+        <w:t xml:space="preserve">Reliability layers do not make a model more accurate; they tell you which answers to trust, so judge them on correct answers over all inputs.</w:t>
       </w:r>
     </w:p>
     <w:p>
@@ -60,7 +60,7 @@
         </w:numPr>
       </w:pPr>
       <w:r>
-        <w:t xml:space="preserve">Start with a check that costs nothing: matching answers' words against the vocabulary split them into groups 83 and 28 percent right; three paid layers changed one answer.</w:t>
+        <w:t xml:space="preserve">Start with a check that costs nothing: matching answers' words to the vocabulary's own names sorted them by trustworthiness; three paid layers together changed one answer.</w:t>
       </w:r>
     </w:p>
     <w:p>
@@ -72,7 +72,7 @@
         </w:numPr>
       </w:pPr>
       <w:r>
-        <w:t xml:space="preserve">Ask the model to read, never to remember: it picked well from a menu but invented 13 to 18 percent of the codes asked of it.</w:t>
+        <w:t xml:space="preserve">Ask the model to read, never to remember: it picked well from a menu but invented 13 to 18 percent of codes asked of it.</w:t>
       </w:r>
     </w:p>
     <w:p>
@@ -84,7 +84,7 @@
         </w:numPr>
       </w:pPr>
       <w:r>
-        <w:t xml:space="preserve">Make repeat runs a validation step: rerun the same inputs, measure how far the answers move, and set the difference you accept; ours agreed on 70 percent at temperature 0.</w:t>
+        <w:t xml:space="preserve">Make repeat runs a validation step: rerun the same inputs, measure how far answers move, set the difference you accept; ours agreed 70 percent at temperature 0.</w:t>
       </w:r>
     </w:p>
     <w:p>
@@ -96,7 +96,7 @@
         </w:numPr>
       </w:pPr>
       <w:r>
-        <w:t xml:space="preserve">Measure correct answers over all inputs, not only those the system chose to answer; refusing always makes the remaining answers look more accurate.</w:t>
+        <w:t xml:space="preserve">Study the data before adding layers: our biggest gains came from learning the corpus's annotation conventions, not medicine; no layer recovers what the model failed to read.</w:t>
       </w:r>
     </w:p>
     <w:p>
@@ -965,7 +965,7 @@
         <w:pStyle w:val="BodyText"/>
       </w:pPr>
       <w:r>
-        <w:t xml:space="preserve">The first column is not weak but broken: eight to twelve times worse than the second, for 1.7 times the tokens. It answered</w:t>
+        <w:t xml:space="preserve">The first column is not weak but broken: eight to twelve times worse than the second. It answered</w:t>
       </w:r>
       <w:r>
         <w:t xml:space="preserve"> </w:t>
@@ -1079,7 +1079,7 @@
         <w:pStyle w:val="BodyText"/>
       </w:pPr>
       <w:r>
-        <w:t xml:space="preserve">We ran the extraction step three times, cold, on the same 40 documents, at temperature 0. Two were byte-identical; the third diverged from its fifth request on: 87, 87 and 98 correct of 226, four points of F1. The third still agreed with the pair on 70 percent of mentions outright, and on 84 percent of codes where all three found the same span; the remainder was worth those four points.</w:t>
+        <w:t xml:space="preserve">We ran the extraction step three times, cold, on the same 40 documents, at temperature 0. Two were byte-identical; the third diverged from its fifth request on: 87, 87 and 98 correct of 226, four points of F1. It still agreed with the pair on 70 percent of mentions outright, and on 84 percent of codes where all three found the same span; the remainder was worth those four points.</w:t>
       </w:r>
     </w:p>
     <w:p>
@@ -2855,7 +2855,7 @@
         <w:pStyle w:val="BodyText"/>
       </w:pPr>
       <w:r>
-        <w:t xml:space="preserve">Only one verdict travels through the ladder, the vocabulary check's; self-correction, voting and the judge each write a field that nothing reads. No test caught this, because every layer does what it says.</w:t>
+        <w:t xml:space="preserve">Only one verdict travels through the ladder, the vocabulary check's; self-correction, voting and the judge each write a field that nothing reads.</w:t>
       </w:r>
     </w:p>
     <w:p>
@@ -2974,7 +2974,7 @@
         <w:t xml:space="preserve"> </w:t>
       </w:r>
       <w:r>
-        <w:t xml:space="preserve">Three runs minimum, all reported; run any go/no-go probe on the denominator the change will be scored on.</w:t>
+        <w:t xml:space="preserve">Three runs minimum, all reported, and decide what difference you will accept; run any go/no-go probe on the denominator the change will be scored on.</w:t>
       </w:r>
     </w:p>
     <w:p>

</xml_diff>

<commit_message>
InfoQ CADEC article: Figure 2 stops restating the table
The shipped-set figure printed "ships N · F1 x" beside every rule, the two
columns the table beneath it already carries as three-run means. The figure
is the first run alone, so the same row appeared twice with different
numbers (ships 230 against 233, F1 0.397 against 0.405) and the reader was
left to reconcile them from two captions.

The figure now keeps only what the table cannot show, the withheld records
and how many of them were correct, and says "first run" in its title. A test
keeps the annotation out. Word export regenerated.

Co-Authored-By: Claude Fable 5.1 <noreply@anthropic.com>
</commit_message>
<xml_diff>
--- a/docs/Group 3 – Six Reliability Layers Around an LLM Sorted Its Answers and Fixed Almost None.docx
+++ b/docs/Group 3 – Six Reliability Layers Around an LLM Sorted Its Answers and Fixed Almost None.docx
@@ -1773,7 +1773,7 @@
       <w:r>
         <w:drawing>
           <wp:inline>
-            <wp:extent cx="5334000" cy="2600086"/>
+            <wp:extent cx="5334000" cy="2593887"/>
             <wp:effectExtent b="0" l="0" r="0" t="0"/>
             <wp:docPr descr="Figure 2" title="" id="18" name="Picture"/>
             <a:graphic>
@@ -1794,7 +1794,7 @@
                   <pic:spPr bwMode="auto">
                     <a:xfrm>
                       <a:off x="0" y="0"/>
-                      <a:ext cx="5334000" cy="2600086"/>
+                      <a:ext cx="5334000" cy="2593887"/>
                     </a:xfrm>
                     <a:prstGeom prst="rect">
                       <a:avLst/>

</xml_diff>

<commit_message>
InfoQ CADEC article: the dial table on the first run, the same basis as Figure 2
The table under Figure 2 gave three-run means while the figure, the ceiling
lines and the "moving from the top row" paragraph were the first run, so the
same rule read ships 230 in the figure and 233 in the table. Every other
count in the article is per-run, so the table now carries the first run's
rows and its caption says so. Two prose figures moved with it: shipping
everything is 0.38 not 0.39, and strict voting gives up eight points of F1,
not six.

A test reads the article's table against the report's first draw so the two
cannot drift apart again. Word export regenerated, decision logged.

Co-Authored-By: Claude Fable 5.1 <noreply@anthropic.com>
</commit_message>
<xml_diff>
--- a/docs/Group 3 – Six Reliability Layers Around an LLM Sorted Its Answers and Fixed Almost None.docx
+++ b/docs/Group 3 – Six Reliability Layers Around an LLM Sorted Its Answers and Fixed Almost None.docx
@@ -1965,7 +1965,7 @@
               <w:pStyle w:val="Compact"/>
             </w:pPr>
             <w:r>
-              <w:t xml:space="preserve">233</w:t>
+              <w:t xml:space="preserve">230</w:t>
             </w:r>
           </w:p>
         </w:tc>
@@ -1987,18 +1987,18 @@
               <w:pStyle w:val="Compact"/>
             </w:pPr>
             <w:r>
-              <w:t xml:space="preserve">90</w:t>
-            </w:r>
-          </w:p>
-        </w:tc>
-        <w:tc>
-          <w:tcPr/>
-          <w:p>
-            <w:pPr>
-              <w:pStyle w:val="Compact"/>
-            </w:pPr>
-            <w:r>
-              <w:t xml:space="preserve">0.39</w:t>
+              <w:t xml:space="preserve">88</w:t>
+            </w:r>
+          </w:p>
+        </w:tc>
+        <w:tc>
+          <w:tcPr/>
+          <w:p>
+            <w:pPr>
+              <w:pStyle w:val="Compact"/>
+            </w:pPr>
+            <w:r>
+              <w:t xml:space="preserve">0.38</w:t>
             </w:r>
           </w:p>
         </w:tc>
@@ -2013,18 +2013,18 @@
                 <w:b/>
                 <w:bCs/>
               </w:rPr>
-              <w:t xml:space="preserve">0.388</w:t>
-            </w:r>
-          </w:p>
-        </w:tc>
-        <w:tc>
-          <w:tcPr/>
-          <w:p>
-            <w:pPr>
-              <w:pStyle w:val="Compact"/>
-            </w:pPr>
-            <w:r>
-              <w:t xml:space="preserve">0.405</w:t>
+              <w:t xml:space="preserve">0.383</w:t>
+            </w:r>
+          </w:p>
+        </w:tc>
+        <w:tc>
+          <w:tcPr/>
+          <w:p>
+            <w:pPr>
+              <w:pStyle w:val="Compact"/>
+            </w:pPr>
+            <w:r>
+              <w:t xml:space="preserve">0.397</w:t>
             </w:r>
           </w:p>
         </w:tc>
@@ -2069,29 +2069,29 @@
               <w:pStyle w:val="Compact"/>
             </w:pPr>
             <w:r>
-              <w:t xml:space="preserve">52</w:t>
-            </w:r>
-          </w:p>
-        </w:tc>
-        <w:tc>
-          <w:tcPr/>
-          <w:p>
-            <w:pPr>
-              <w:pStyle w:val="Compact"/>
-            </w:pPr>
-            <w:r>
-              <w:t xml:space="preserve">180</w:t>
-            </w:r>
-          </w:p>
-        </w:tc>
-        <w:tc>
-          <w:tcPr/>
-          <w:p>
-            <w:pPr>
-              <w:pStyle w:val="Compact"/>
-            </w:pPr>
-            <w:r>
-              <w:t xml:space="preserve">40</w:t>
+              <w:t xml:space="preserve">53</w:t>
+            </w:r>
+          </w:p>
+        </w:tc>
+        <w:tc>
+          <w:tcPr/>
+          <w:p>
+            <w:pPr>
+              <w:pStyle w:val="Compact"/>
+            </w:pPr>
+            <w:r>
+              <w:t xml:space="preserve">177</w:t>
+            </w:r>
+          </w:p>
+        </w:tc>
+        <w:tc>
+          <w:tcPr/>
+          <w:p>
+            <w:pPr>
+              <w:pStyle w:val="Compact"/>
+            </w:pPr>
+            <w:r>
+              <w:t xml:space="preserve">39</w:t>
             </w:r>
           </w:p>
         </w:tc>
@@ -2106,29 +2106,29 @@
                 <w:b/>
                 <w:bCs/>
               </w:rPr>
-              <w:t xml:space="preserve">0.77</w:t>
-            </w:r>
-          </w:p>
-        </w:tc>
-        <w:tc>
-          <w:tcPr/>
-          <w:p>
-            <w:pPr>
-              <w:pStyle w:val="Compact"/>
-            </w:pPr>
-            <w:r>
-              <w:t xml:space="preserve">0.173</w:t>
-            </w:r>
-          </w:p>
-        </w:tc>
-        <w:tc>
-          <w:tcPr/>
-          <w:p>
-            <w:pPr>
-              <w:pStyle w:val="Compact"/>
-            </w:pPr>
-            <w:r>
-              <w:t xml:space="preserve">0.292</w:t>
+              <w:t xml:space="preserve">0.74</w:t>
+            </w:r>
+          </w:p>
+        </w:tc>
+        <w:tc>
+          <w:tcPr/>
+          <w:p>
+            <w:pPr>
+              <w:pStyle w:val="Compact"/>
+            </w:pPr>
+            <w:r>
+              <w:t xml:space="preserve">0.170</w:t>
+            </w:r>
+          </w:p>
+        </w:tc>
+        <w:tc>
+          <w:tcPr/>
+          <w:p>
+            <w:pPr>
+              <w:pStyle w:val="Compact"/>
+            </w:pPr>
+            <w:r>
+              <w:t xml:space="preserve">0.283</w:t>
             </w:r>
           </w:p>
         </w:tc>
@@ -2174,51 +2174,51 @@
               <w:pStyle w:val="Compact"/>
             </w:pPr>
             <w:r>
-              <w:t xml:space="preserve">142</w:t>
-            </w:r>
-          </w:p>
-        </w:tc>
-        <w:tc>
-          <w:tcPr/>
-          <w:p>
-            <w:pPr>
-              <w:pStyle w:val="Compact"/>
-            </w:pPr>
-            <w:r>
-              <w:t xml:space="preserve">55</w:t>
-            </w:r>
-          </w:p>
-        </w:tc>
-        <w:tc>
-          <w:tcPr/>
-          <w:p>
-            <w:pPr>
-              <w:pStyle w:val="Compact"/>
-            </w:pPr>
-            <w:r>
-              <w:t xml:space="preserve">0.61</w:t>
-            </w:r>
-          </w:p>
-        </w:tc>
-        <w:tc>
-          <w:tcPr/>
-          <w:p>
-            <w:pPr>
-              <w:pStyle w:val="Compact"/>
-            </w:pPr>
-            <w:r>
-              <w:t xml:space="preserve">0.236</w:t>
-            </w:r>
-          </w:p>
-        </w:tc>
-        <w:tc>
-          <w:tcPr/>
-          <w:p>
-            <w:pPr>
-              <w:pStyle w:val="Compact"/>
-            </w:pPr>
-            <w:r>
-              <w:t xml:space="preserve">0.353</w:t>
+              <w:t xml:space="preserve">139</w:t>
+            </w:r>
+          </w:p>
+        </w:tc>
+        <w:tc>
+          <w:tcPr/>
+          <w:p>
+            <w:pPr>
+              <w:pStyle w:val="Compact"/>
+            </w:pPr>
+            <w:r>
+              <w:t xml:space="preserve">53</w:t>
+            </w:r>
+          </w:p>
+        </w:tc>
+        <w:tc>
+          <w:tcPr/>
+          <w:p>
+            <w:pPr>
+              <w:pStyle w:val="Compact"/>
+            </w:pPr>
+            <w:r>
+              <w:t xml:space="preserve">0.58</w:t>
+            </w:r>
+          </w:p>
+        </w:tc>
+        <w:tc>
+          <w:tcPr/>
+          <w:p>
+            <w:pPr>
+              <w:pStyle w:val="Compact"/>
+            </w:pPr>
+            <w:r>
+              <w:t xml:space="preserve">0.230</w:t>
+            </w:r>
+          </w:p>
+        </w:tc>
+        <w:tc>
+          <w:tcPr/>
+          <w:p>
+            <w:pPr>
+              <w:pStyle w:val="Compact"/>
+            </w:pPr>
+            <w:r>
+              <w:t xml:space="preserve">0.340</w:t>
             </w:r>
           </w:p>
         </w:tc>
@@ -2253,73 +2253,73 @@
               <w:pStyle w:val="Compact"/>
             </w:pPr>
             <w:r>
-              <w:t xml:space="preserve">116</w:t>
-            </w:r>
-          </w:p>
-        </w:tc>
-        <w:tc>
-          <w:tcPr/>
-          <w:p>
-            <w:pPr>
-              <w:pStyle w:val="Compact"/>
-            </w:pPr>
-            <w:r>
-              <w:t xml:space="preserve">117</w:t>
-            </w:r>
-          </w:p>
-        </w:tc>
-        <w:tc>
-          <w:tcPr/>
-          <w:p>
-            <w:pPr>
-              <w:pStyle w:val="Compact"/>
-            </w:pPr>
-            <w:r>
-              <w:t xml:space="preserve">57</w:t>
-            </w:r>
-          </w:p>
-        </w:tc>
-        <w:tc>
-          <w:tcPr/>
-          <w:p>
-            <w:pPr>
-              <w:pStyle w:val="Compact"/>
-            </w:pPr>
-            <w:r>
-              <w:t xml:space="preserve">0.50</w:t>
-            </w:r>
-          </w:p>
-        </w:tc>
-        <w:tc>
-          <w:tcPr/>
-          <w:p>
-            <w:pPr>
-              <w:pStyle w:val="Compact"/>
-            </w:pPr>
-            <w:r>
-              <w:t xml:space="preserve">0.246</w:t>
-            </w:r>
-          </w:p>
-        </w:tc>
-        <w:tc>
-          <w:tcPr/>
-          <w:p>
-            <w:pPr>
-              <w:pStyle w:val="Compact"/>
-            </w:pPr>
-            <w:r>
-              <w:t xml:space="preserve">0.345</w:t>
-            </w:r>
-          </w:p>
-        </w:tc>
-        <w:tc>
-          <w:tcPr/>
-          <w:p>
-            <w:pPr>
-              <w:pStyle w:val="Compact"/>
-            </w:pPr>
-            <w:r>
-              <w:t xml:space="preserve">~420,000</w:t>
+              <w:t xml:space="preserve">108</w:t>
+            </w:r>
+          </w:p>
+        </w:tc>
+        <w:tc>
+          <w:tcPr/>
+          <w:p>
+            <w:pPr>
+              <w:pStyle w:val="Compact"/>
+            </w:pPr>
+            <w:r>
+              <w:t xml:space="preserve">122</w:t>
+            </w:r>
+          </w:p>
+        </w:tc>
+        <w:tc>
+          <w:tcPr/>
+          <w:p>
+            <w:pPr>
+              <w:pStyle w:val="Compact"/>
+            </w:pPr>
+            <w:r>
+              <w:t xml:space="preserve">51</w:t>
+            </w:r>
+          </w:p>
+        </w:tc>
+        <w:tc>
+          <w:tcPr/>
+          <w:p>
+            <w:pPr>
+              <w:pStyle w:val="Compact"/>
+            </w:pPr>
+            <w:r>
+              <w:t xml:space="preserve">0.47</w:t>
+            </w:r>
+          </w:p>
+        </w:tc>
+        <w:tc>
+          <w:tcPr/>
+          <w:p>
+            <w:pPr>
+              <w:pStyle w:val="Compact"/>
+            </w:pPr>
+            <w:r>
+              <w:t xml:space="preserve">0.222</w:t>
+            </w:r>
+          </w:p>
+        </w:tc>
+        <w:tc>
+          <w:tcPr/>
+          <w:p>
+            <w:pPr>
+              <w:pStyle w:val="Compact"/>
+            </w:pPr>
+            <w:r>
+              <w:t xml:space="preserve">0.315</w:t>
+            </w:r>
+          </w:p>
+        </w:tc>
+        <w:tc>
+          <w:tcPr/>
+          <w:p>
+            <w:pPr>
+              <w:pStyle w:val="Compact"/>
+            </w:pPr>
+            <w:r>
+              <w:t xml:space="preserve">~411,000</w:t>
             </w:r>
           </w:p>
         </w:tc>
@@ -2343,73 +2343,73 @@
               <w:pStyle w:val="Compact"/>
             </w:pPr>
             <w:r>
-              <w:t xml:space="preserve">186</w:t>
-            </w:r>
-          </w:p>
-        </w:tc>
-        <w:tc>
-          <w:tcPr/>
-          <w:p>
-            <w:pPr>
-              <w:pStyle w:val="Compact"/>
-            </w:pPr>
-            <w:r>
-              <w:t xml:space="preserve">46</w:t>
-            </w:r>
-          </w:p>
-        </w:tc>
-        <w:tc>
-          <w:tcPr/>
-          <w:p>
-            <w:pPr>
-              <w:pStyle w:val="Compact"/>
-            </w:pPr>
-            <w:r>
-              <w:t xml:space="preserve">79</w:t>
-            </w:r>
-          </w:p>
-        </w:tc>
-        <w:tc>
-          <w:tcPr/>
-          <w:p>
-            <w:pPr>
-              <w:pStyle w:val="Compact"/>
-            </w:pPr>
-            <w:r>
-              <w:t xml:space="preserve">0.43</w:t>
-            </w:r>
-          </w:p>
-        </w:tc>
-        <w:tc>
-          <w:tcPr/>
-          <w:p>
-            <w:pPr>
-              <w:pStyle w:val="Compact"/>
-            </w:pPr>
-            <w:r>
-              <w:t xml:space="preserve">0.341</w:t>
-            </w:r>
-          </w:p>
-        </w:tc>
-        <w:tc>
-          <w:tcPr/>
-          <w:p>
-            <w:pPr>
-              <w:pStyle w:val="Compact"/>
-            </w:pPr>
-            <w:r>
-              <w:t xml:space="preserve">0.396</w:t>
-            </w:r>
-          </w:p>
-        </w:tc>
-        <w:tc>
-          <w:tcPr/>
-          <w:p>
-            <w:pPr>
-              <w:pStyle w:val="Compact"/>
-            </w:pPr>
-            <w:r>
-              <w:t xml:space="preserve">~420,000</w:t>
+              <w:t xml:space="preserve">185</w:t>
+            </w:r>
+          </w:p>
+        </w:tc>
+        <w:tc>
+          <w:tcPr/>
+          <w:p>
+            <w:pPr>
+              <w:pStyle w:val="Compact"/>
+            </w:pPr>
+            <w:r>
+              <w:t xml:space="preserve">45</w:t>
+            </w:r>
+          </w:p>
+        </w:tc>
+        <w:tc>
+          <w:tcPr/>
+          <w:p>
+            <w:pPr>
+              <w:pStyle w:val="Compact"/>
+            </w:pPr>
+            <w:r>
+              <w:t xml:space="preserve">77</w:t>
+            </w:r>
+          </w:p>
+        </w:tc>
+        <w:tc>
+          <w:tcPr/>
+          <w:p>
+            <w:pPr>
+              <w:pStyle w:val="Compact"/>
+            </w:pPr>
+            <w:r>
+              <w:t xml:space="preserve">0.42</w:t>
+            </w:r>
+          </w:p>
+        </w:tc>
+        <w:tc>
+          <w:tcPr/>
+          <w:p>
+            <w:pPr>
+              <w:pStyle w:val="Compact"/>
+            </w:pPr>
+            <w:r>
+              <w:t xml:space="preserve">0.335</w:t>
+            </w:r>
+          </w:p>
+        </w:tc>
+        <w:tc>
+          <w:tcPr/>
+          <w:p>
+            <w:pPr>
+              <w:pStyle w:val="Compact"/>
+            </w:pPr>
+            <w:r>
+              <w:t xml:space="preserve">0.387</w:t>
+            </w:r>
+          </w:p>
+        </w:tc>
+        <w:tc>
+          <w:tcPr/>
+          <w:p>
+            <w:pPr>
+              <w:pStyle w:val="Compact"/>
+            </w:pPr>
+            <w:r>
+              <w:t xml:space="preserve">~411,000</w:t>
             </w:r>
           </w:p>
         </w:tc>
@@ -2433,7 +2433,7 @@
               <w:pStyle w:val="Compact"/>
             </w:pPr>
             <w:r>
-              <w:t xml:space="preserve">138</w:t>
+              <w:t xml:space="preserve">136</w:t>
             </w:r>
           </w:p>
         </w:tc>
@@ -2455,40 +2455,40 @@
               <w:pStyle w:val="Compact"/>
             </w:pPr>
             <w:r>
-              <w:t xml:space="preserve">65</w:t>
-            </w:r>
-          </w:p>
-        </w:tc>
-        <w:tc>
-          <w:tcPr/>
-          <w:p>
-            <w:pPr>
-              <w:pStyle w:val="Compact"/>
-            </w:pPr>
-            <w:r>
-              <w:t xml:space="preserve">0.47</w:t>
-            </w:r>
-          </w:p>
-        </w:tc>
-        <w:tc>
-          <w:tcPr/>
-          <w:p>
-            <w:pPr>
-              <w:pStyle w:val="Compact"/>
-            </w:pPr>
-            <w:r>
-              <w:t xml:space="preserve">0.278</w:t>
-            </w:r>
-          </w:p>
-        </w:tc>
-        <w:tc>
-          <w:tcPr/>
-          <w:p>
-            <w:pPr>
-              <w:pStyle w:val="Compact"/>
-            </w:pPr>
-            <w:r>
-              <w:t xml:space="preserve">0.363</w:t>
+              <w:t xml:space="preserve">63</w:t>
+            </w:r>
+          </w:p>
+        </w:tc>
+        <w:tc>
+          <w:tcPr/>
+          <w:p>
+            <w:pPr>
+              <w:pStyle w:val="Compact"/>
+            </w:pPr>
+            <w:r>
+              <w:t xml:space="preserve">0.46</w:t>
+            </w:r>
+          </w:p>
+        </w:tc>
+        <w:tc>
+          <w:tcPr/>
+          <w:p>
+            <w:pPr>
+              <w:pStyle w:val="Compact"/>
+            </w:pPr>
+            <w:r>
+              <w:t xml:space="preserve">0.274</w:t>
+            </w:r>
+          </w:p>
+        </w:tc>
+        <w:tc>
+          <w:tcPr/>
+          <w:p>
+            <w:pPr>
+              <w:pStyle w:val="Compact"/>
+            </w:pPr>
+            <w:r>
+              <w:t xml:space="preserve">0.357</w:t>
             </w:r>
           </w:p>
         </w:tc>
@@ -2523,29 +2523,29 @@
               <w:pStyle w:val="Compact"/>
             </w:pPr>
             <w:r>
-              <w:t xml:space="preserve">141</w:t>
-            </w:r>
-          </w:p>
-        </w:tc>
-        <w:tc>
-          <w:tcPr/>
-          <w:p>
-            <w:pPr>
-              <w:pStyle w:val="Compact"/>
-            </w:pPr>
-            <w:r>
-              <w:t xml:space="preserve">91</w:t>
-            </w:r>
-          </w:p>
-        </w:tc>
-        <w:tc>
-          <w:tcPr/>
-          <w:p>
-            <w:pPr>
-              <w:pStyle w:val="Compact"/>
-            </w:pPr>
-            <w:r>
-              <w:t xml:space="preserve">77</w:t>
+              <w:t xml:space="preserve">136</w:t>
+            </w:r>
+          </w:p>
+        </w:tc>
+        <w:tc>
+          <w:tcPr/>
+          <w:p>
+            <w:pPr>
+              <w:pStyle w:val="Compact"/>
+            </w:pPr>
+            <w:r>
+              <w:t xml:space="preserve">94</w:t>
+            </w:r>
+          </w:p>
+        </w:tc>
+        <w:tc>
+          <w:tcPr/>
+          <w:p>
+            <w:pPr>
+              <w:pStyle w:val="Compact"/>
+            </w:pPr>
+            <w:r>
+              <w:t xml:space="preserve">74</w:t>
             </w:r>
           </w:p>
         </w:tc>
@@ -2567,7 +2567,7 @@
               <w:pStyle w:val="Compact"/>
             </w:pPr>
             <w:r>
-              <w:t xml:space="preserve">0.331</w:t>
+              <w:t xml:space="preserve">0.322</w:t>
             </w:r>
           </w:p>
         </w:tc>
@@ -2582,7 +2582,7 @@
                 <w:b/>
                 <w:bCs/>
               </w:rPr>
-              <w:t xml:space="preserve">0.430</w:t>
+              <w:t xml:space="preserve">0.420</w:t>
             </w:r>
           </w:p>
         </w:tc>
@@ -2608,7 +2608,7 @@
           <w:i/>
           <w:iCs/>
         </w:rPr>
-        <w:t xml:space="preserve">Means over three development runs of 230, 230 and 238 records against 226 annotated mentions. Accuracy is correct over shipped; yield is correct over all records; F1 is span-exact on what ships, so a withheld answer is a miss. Voting rows send a split or a missing sample to a person; the loose check accepts a span contained in a concept name.</w:t>
+        <w:t xml:space="preserve">First development run, the 230 records of Figure 2, against 226 annotated mentions; the other two runs are in the layer table above. Accuracy is correct over shipped; yield is correct over all records; F1 is span-exact on what ships, so a withheld answer is a miss. Voting rows send a split or a missing sample to a person; the loose check accepts a span contained in a concept name.</w:t>
       </w:r>
     </w:p>
     <w:p>
@@ -2616,7 +2616,7 @@
         <w:pStyle w:val="BodyText"/>
       </w:pPr>
       <w:r>
-        <w:t xml:space="preserve">Filter on any verdict and accuracy rises above the 0.39 of shipping everything, so the paid verdicts were not noise, and every row ships fewer correct answers because every one withholds. F1 sees both sides. ACCEPT and strict voting give up eleven and six points of it to send half or more of the batch to a person; the loose check, loose voting and the blind judge land within about five points of shipping everything; only the menu-shown judge clears it, by two to three points on every run, for 84,000 tokens.</w:t>
+        <w:t xml:space="preserve">Filter on any verdict and accuracy rises above the 0.38 of shipping everything, so the paid verdicts were not noise, and every row ships fewer correct answers because every one withholds. F1 sees both sides. ACCEPT and strict voting give up eleven and eight points of it to send half or more of the batch to a person; the loose check, loose voting and the blind judge land within six points of shipping everything; only the menu-shown judge clears it, by two to three points on every run, for 84,000 tokens.</w:t>
       </w:r>
     </w:p>
     <w:p>

</xml_diff>

<commit_message>
InfoQ CADEC article: Wejdan's author bio, and the word budget stops at About the authors
The body sat at 2,985 words, so two 75-word bios could never fit a count that
included them; InfoQ shows bios as author metadata beside the article, so the
budget test now cuts at the section heading, a second test proves the cut is
real, and a bio-length test (two bios, 50-100 words each) is xfail(strict)
until Pushpdeep's bio lands. Bio written in the pattern of the eleven bios on
InfoQ's six most recent articles: role and employer, specialism, track record,
relevant degree. Word export regenerated.

Co-Authored-By: Claude Fable 5.1 <noreply@anthropic.com>
</commit_message>
<xml_diff>
--- a/docs/Group 3 – Six Reliability Layers Around an LLM Sorted Its Answers and Fixed Almost None.docx
+++ b/docs/Group 3 – Six Reliability Layers Around an LLM Sorted Its Answers and Fixed Almost None.docx
@@ -3326,11 +3326,13 @@
         <w:t xml:space="preserve"> </w:t>
       </w:r>
       <w:r>
-        <w:t xml:space="preserve">and</w:t>
-      </w:r>
-      <w:r>
-        <w:t xml:space="preserve"> </w:t>
-      </w:r>
+        <w:t xml:space="preserve">is Senior Manager, AI Engineering at US Pharmacopeia (USP), the standards body for medicine quality, where she leads the team building LLM pipelines that turn scientific documents into structured, auditable data. She specialises in reliability for AI in regulated settings: evaluation methodology, provenance, and the line between what a model decides and what deterministic code enforces. She has spent seven years shipping machine learning in healthcare and pharmaceutical quality, and holds an M.S. in Health Informatics from George Mason University.</w:t>
+      </w:r>
+    </w:p>
+    <w:p>
+      <w:pPr>
+        <w:pStyle w:val="BodyText"/>
+      </w:pPr>
       <w:r>
         <w:rPr>
           <w:b/>
@@ -3339,7 +3341,7 @@
         <w:t xml:space="preserve">Pushpdeep Mishra</w:t>
       </w:r>
       <w:r>
-        <w:t xml:space="preserve">.</w:t>
+        <w:t xml:space="preserve"> </w:t>
       </w:r>
     </w:p>
     <w:bookmarkEnd w:id="29"/>

</xml_diff>